<commit_message>
fix(kt09): add basic Windows-Android public web matrix
Co-authored-by: Cursor <cursoragent@cursor.com>
</commit_message>
<xml_diff>
--- a/reports/KT09.docx
+++ b/reports/KT09.docx
@@ -531,7 +531,7 @@
           <w:b/>
           <w:sz w:val="28"/>
         </w:rPr>
-        <w:t>6. Кроссплатформенность</w:t>
+        <w:t>6. Кроссплатформенность (жесты)</w:t>
       </w:r>
     </w:p>
     <w:p>
@@ -544,7 +544,7 @@
           <w:b/>
           <w:sz w:val="24"/>
         </w:rPr>
-        <w:t>Общий контракт GesturePort позволяет в будущем подключить XCUITest. Факт: протестирован только Android. iOS NOT RUN — нет симулятора/драйвера/сборки. Общий код ≠ успешный прогон на двух ОС.</w:t>
+        <w:t>Общий контракт GesturePort позволяет в будущем подключить XCUITest. Жесты: протестирован только Android. iOS NOT RUN — нет симулятора/драйвера/сборки.</w:t>
       </w:r>
     </w:p>
     <w:p>
@@ -557,7 +557,72 @@
           <w:b/>
           <w:sz w:val="28"/>
         </w:rPr>
-        <w:t>7. Скриншоты</w:t>
+        <w:t>7. Remediation: BASIC OS×OS public web (2026-10-10)</w:t>
+      </w:r>
+    </w:p>
+    <w:p>
+      <w:pPr>
+        <w:spacing w:after="120"/>
+      </w:pPr>
+      <w:r>
+        <w:rPr>
+          <w:rFonts w:ascii="Times New Roman" w:hAnsi="Times New Roman" w:eastAsia="Times New Roman"/>
+          <w:b w:val="0"/>
+          <w:sz w:val="24"/>
+        </w:rPr>
+        <w:t>Матрица публичного Sauce Demo: Windows Chrome PASS, Windows Firefox PASS, Android Chrome PARTIAL (adb intent + screencap; ChromeDriver 134 отсутствует для DOM-логина), iOS NOT RUN.</w:t>
+      </w:r>
+    </w:p>
+    <w:p>
+      <w:pPr>
+        <w:spacing w:after="0"/>
+      </w:pPr>
+      <w:r>
+        <w:rPr>
+          <w:rFonts w:ascii="Consolas" w:hAnsi="Consolas" w:eastAsia="Consolas"/>
+          <w:b w:val="0"/>
+          <w:sz w:val="18"/>
+        </w:rPr>
+        <w:t>Windows: 2 passed in 12.43s</w:t>
+      </w:r>
+    </w:p>
+    <w:p>
+      <w:pPr>
+        <w:spacing w:after="0"/>
+      </w:pPr>
+      <w:r>
+        <w:rPr>
+          <w:rFonts w:ascii="Consolas" w:hAnsi="Consolas" w:eastAsia="Consolas"/>
+          <w:b w:val="0"/>
+          <w:sz w:val="18"/>
+        </w:rPr>
+        <w:t>Android smoke pytest: 1 passed in 99.04s (cell result=PARTIAL)</w:t>
+      </w:r>
+    </w:p>
+    <w:p>
+      <w:pPr>
+        <w:spacing w:after="0"/>
+      </w:pPr>
+      <w:r>
+        <w:rPr>
+          <w:rFonts w:ascii="Consolas" w:hAnsi="Consolas" w:eastAsia="Consolas"/>
+          <w:b w:val="0"/>
+          <w:sz w:val="18"/>
+        </w:rPr>
+        <w:t>See docs/kt09/basic-cross-platform-matrix.md</w:t>
+      </w:r>
+    </w:p>
+    <w:p>
+      <w:pPr>
+        <w:pStyle w:val="Heading1"/>
+      </w:pPr>
+      <w:r>
+        <w:rPr>
+          <w:rFonts w:ascii="Times New Roman" w:hAnsi="Times New Roman" w:eastAsia="Times New Roman"/>
+          <w:b/>
+          <w:sz w:val="28"/>
+        </w:rPr>
+        <w:t>8. Скриншоты — жесты Android</w:t>
       </w:r>
     </w:p>
     <w:p>
@@ -1060,7 +1125,314 @@
           <w:b/>
           <w:sz w:val="28"/>
         </w:rPr>
-        <w:t>8. Заключение</w:t>
+        <w:t>9. Скриншоты — BASIC cross-platform web</w:t>
+      </w:r>
+    </w:p>
+    <w:p>
+      <w:r>
+        <w:drawing>
+          <wp:inline xmlns:a="http://schemas.openxmlformats.org/drawingml/2006/main" xmlns:pic="http://schemas.openxmlformats.org/drawingml/2006/picture">
+            <wp:extent cx="3240000" cy="1919905"/>
+            <wp:docPr id="11" name="Picture 11"/>
+            <wp:cNvGraphicFramePr>
+              <a:graphicFrameLocks noChangeAspect="1"/>
+            </wp:cNvGraphicFramePr>
+            <a:graphic>
+              <a:graphicData uri="http://schemas.openxmlformats.org/drawingml/2006/picture">
+                <pic:pic>
+                  <pic:nvPicPr>
+                    <pic:cNvPr id="0" name="windows_chrome_01_login.png"/>
+                    <pic:cNvPicPr/>
+                  </pic:nvPicPr>
+                  <pic:blipFill>
+                    <a:blip r:embed="rId19"/>
+                    <a:stretch>
+                      <a:fillRect/>
+                    </a:stretch>
+                  </pic:blipFill>
+                  <pic:spPr>
+                    <a:xfrm>
+                      <a:off x="0" y="0"/>
+                      <a:ext cx="3240000" cy="1919905"/>
+                    </a:xfrm>
+                    <a:prstGeom prst="rect"/>
+                  </pic:spPr>
+                </pic:pic>
+              </a:graphicData>
+            </a:graphic>
+          </wp:inline>
+        </w:drawing>
+      </w:r>
+    </w:p>
+    <w:p>
+      <w:pPr>
+        <w:jc w:val="center"/>
+      </w:pPr>
+      <w:r>
+        <w:rPr>
+          <w:rFonts w:ascii="Times New Roman" w:hAnsi="Times New Roman" w:eastAsia="Times New Roman"/>
+          <w:b w:val="0"/>
+          <w:sz w:val="22"/>
+        </w:rPr>
+        <w:t>Рисунок 11 — Windows Chrome login</w:t>
+      </w:r>
+    </w:p>
+    <w:p>
+      <w:r>
+        <w:drawing>
+          <wp:inline xmlns:a="http://schemas.openxmlformats.org/drawingml/2006/main" xmlns:pic="http://schemas.openxmlformats.org/drawingml/2006/picture">
+            <wp:extent cx="3240000" cy="1919905"/>
+            <wp:docPr id="12" name="Picture 12"/>
+            <wp:cNvGraphicFramePr>
+              <a:graphicFrameLocks noChangeAspect="1"/>
+            </wp:cNvGraphicFramePr>
+            <a:graphic>
+              <a:graphicData uri="http://schemas.openxmlformats.org/drawingml/2006/picture">
+                <pic:pic>
+                  <pic:nvPicPr>
+                    <pic:cNvPr id="0" name="windows_chrome_02_inventory.png"/>
+                    <pic:cNvPicPr/>
+                  </pic:nvPicPr>
+                  <pic:blipFill>
+                    <a:blip r:embed="rId20"/>
+                    <a:stretch>
+                      <a:fillRect/>
+                    </a:stretch>
+                  </pic:blipFill>
+                  <pic:spPr>
+                    <a:xfrm>
+                      <a:off x="0" y="0"/>
+                      <a:ext cx="3240000" cy="1919905"/>
+                    </a:xfrm>
+                    <a:prstGeom prst="rect"/>
+                  </pic:spPr>
+                </pic:pic>
+              </a:graphicData>
+            </a:graphic>
+          </wp:inline>
+        </w:drawing>
+      </w:r>
+    </w:p>
+    <w:p>
+      <w:pPr>
+        <w:jc w:val="center"/>
+      </w:pPr>
+      <w:r>
+        <w:rPr>
+          <w:rFonts w:ascii="Times New Roman" w:hAnsi="Times New Roman" w:eastAsia="Times New Roman"/>
+          <w:b w:val="0"/>
+          <w:sz w:val="22"/>
+        </w:rPr>
+        <w:t>Рисунок 12 — Windows Chrome inventory</w:t>
+      </w:r>
+    </w:p>
+    <w:p>
+      <w:r>
+        <w:drawing>
+          <wp:inline xmlns:a="http://schemas.openxmlformats.org/drawingml/2006/main" xmlns:pic="http://schemas.openxmlformats.org/drawingml/2006/picture">
+            <wp:extent cx="3240000" cy="2068576"/>
+            <wp:docPr id="13" name="Picture 13"/>
+            <wp:cNvGraphicFramePr>
+              <a:graphicFrameLocks noChangeAspect="1"/>
+            </wp:cNvGraphicFramePr>
+            <a:graphic>
+              <a:graphicData uri="http://schemas.openxmlformats.org/drawingml/2006/picture">
+                <pic:pic>
+                  <pic:nvPicPr>
+                    <pic:cNvPr id="0" name="windows_firefox_01_login.png"/>
+                    <pic:cNvPicPr/>
+                  </pic:nvPicPr>
+                  <pic:blipFill>
+                    <a:blip r:embed="rId21"/>
+                    <a:stretch>
+                      <a:fillRect/>
+                    </a:stretch>
+                  </pic:blipFill>
+                  <pic:spPr>
+                    <a:xfrm>
+                      <a:off x="0" y="0"/>
+                      <a:ext cx="3240000" cy="2068576"/>
+                    </a:xfrm>
+                    <a:prstGeom prst="rect"/>
+                  </pic:spPr>
+                </pic:pic>
+              </a:graphicData>
+            </a:graphic>
+          </wp:inline>
+        </w:drawing>
+      </w:r>
+    </w:p>
+    <w:p>
+      <w:pPr>
+        <w:jc w:val="center"/>
+      </w:pPr>
+      <w:r>
+        <w:rPr>
+          <w:rFonts w:ascii="Times New Roman" w:hAnsi="Times New Roman" w:eastAsia="Times New Roman"/>
+          <w:b w:val="0"/>
+          <w:sz w:val="22"/>
+        </w:rPr>
+        <w:t>Рисунок 13 — Windows Firefox login</w:t>
+      </w:r>
+    </w:p>
+    <w:p>
+      <w:r>
+        <w:drawing>
+          <wp:inline xmlns:a="http://schemas.openxmlformats.org/drawingml/2006/main" xmlns:pic="http://schemas.openxmlformats.org/drawingml/2006/picture">
+            <wp:extent cx="3240000" cy="2068576"/>
+            <wp:docPr id="14" name="Picture 14"/>
+            <wp:cNvGraphicFramePr>
+              <a:graphicFrameLocks noChangeAspect="1"/>
+            </wp:cNvGraphicFramePr>
+            <a:graphic>
+              <a:graphicData uri="http://schemas.openxmlformats.org/drawingml/2006/picture">
+                <pic:pic>
+                  <pic:nvPicPr>
+                    <pic:cNvPr id="0" name="windows_firefox_02_inventory.png"/>
+                    <pic:cNvPicPr/>
+                  </pic:nvPicPr>
+                  <pic:blipFill>
+                    <a:blip r:embed="rId22"/>
+                    <a:stretch>
+                      <a:fillRect/>
+                    </a:stretch>
+                  </pic:blipFill>
+                  <pic:spPr>
+                    <a:xfrm>
+                      <a:off x="0" y="0"/>
+                      <a:ext cx="3240000" cy="2068576"/>
+                    </a:xfrm>
+                    <a:prstGeom prst="rect"/>
+                  </pic:spPr>
+                </pic:pic>
+              </a:graphicData>
+            </a:graphic>
+          </wp:inline>
+        </w:drawing>
+      </w:r>
+    </w:p>
+    <w:p>
+      <w:pPr>
+        <w:jc w:val="center"/>
+      </w:pPr>
+      <w:r>
+        <w:rPr>
+          <w:rFonts w:ascii="Times New Roman" w:hAnsi="Times New Roman" w:eastAsia="Times New Roman"/>
+          <w:b w:val="0"/>
+          <w:sz w:val="22"/>
+        </w:rPr>
+        <w:t>Рисунок 14 — Windows Firefox inventory</w:t>
+      </w:r>
+    </w:p>
+    <w:p>
+      <w:r>
+        <w:drawing>
+          <wp:inline xmlns:a="http://schemas.openxmlformats.org/drawingml/2006/main" xmlns:pic="http://schemas.openxmlformats.org/drawingml/2006/picture">
+            <wp:extent cx="3240000" cy="7200000"/>
+            <wp:docPr id="15" name="Picture 15"/>
+            <wp:cNvGraphicFramePr>
+              <a:graphicFrameLocks noChangeAspect="1"/>
+            </wp:cNvGraphicFramePr>
+            <a:graphic>
+              <a:graphicData uri="http://schemas.openxmlformats.org/drawingml/2006/picture">
+                <pic:pic>
+                  <pic:nvPicPr>
+                    <pic:cNvPr id="0" name="android_chrome_01_login.png"/>
+                    <pic:cNvPicPr/>
+                  </pic:nvPicPr>
+                  <pic:blipFill>
+                    <a:blip r:embed="rId23"/>
+                    <a:stretch>
+                      <a:fillRect/>
+                    </a:stretch>
+                  </pic:blipFill>
+                  <pic:spPr>
+                    <a:xfrm>
+                      <a:off x="0" y="0"/>
+                      <a:ext cx="3240000" cy="7200000"/>
+                    </a:xfrm>
+                    <a:prstGeom prst="rect"/>
+                  </pic:spPr>
+                </pic:pic>
+              </a:graphicData>
+            </a:graphic>
+          </wp:inline>
+        </w:drawing>
+      </w:r>
+    </w:p>
+    <w:p>
+      <w:pPr>
+        <w:jc w:val="center"/>
+      </w:pPr>
+      <w:r>
+        <w:rPr>
+          <w:rFonts w:ascii="Times New Roman" w:hAnsi="Times New Roman" w:eastAsia="Times New Roman"/>
+          <w:b w:val="0"/>
+          <w:sz w:val="22"/>
+        </w:rPr>
+        <w:t>Рисунок 15 — Android Chrome Sauce Demo (PARTIAL)</w:t>
+      </w:r>
+    </w:p>
+    <w:p>
+      <w:r>
+        <w:drawing>
+          <wp:inline xmlns:a="http://schemas.openxmlformats.org/drawingml/2006/main" xmlns:pic="http://schemas.openxmlformats.org/drawingml/2006/picture">
+            <wp:extent cx="3240000" cy="7200000"/>
+            <wp:docPr id="16" name="Picture 16"/>
+            <wp:cNvGraphicFramePr>
+              <a:graphicFrameLocks noChangeAspect="1"/>
+            </wp:cNvGraphicFramePr>
+            <a:graphic>
+              <a:graphicData uri="http://schemas.openxmlformats.org/drawingml/2006/picture">
+                <pic:pic>
+                  <pic:nvPicPr>
+                    <pic:cNvPr id="0" name="android_chrome_02_inventory.png"/>
+                    <pic:cNvPicPr/>
+                  </pic:nvPicPr>
+                  <pic:blipFill>
+                    <a:blip r:embed="rId24"/>
+                    <a:stretch>
+                      <a:fillRect/>
+                    </a:stretch>
+                  </pic:blipFill>
+                  <pic:spPr>
+                    <a:xfrm>
+                      <a:off x="0" y="0"/>
+                      <a:ext cx="3240000" cy="7200000"/>
+                    </a:xfrm>
+                    <a:prstGeom prst="rect"/>
+                  </pic:spPr>
+                </pic:pic>
+              </a:graphicData>
+            </a:graphic>
+          </wp:inline>
+        </w:drawing>
+      </w:r>
+    </w:p>
+    <w:p>
+      <w:pPr>
+        <w:jc w:val="center"/>
+      </w:pPr>
+      <w:r>
+        <w:rPr>
+          <w:rFonts w:ascii="Times New Roman" w:hAnsi="Times New Roman" w:eastAsia="Times New Roman"/>
+          <w:b w:val="0"/>
+          <w:sz w:val="22"/>
+        </w:rPr>
+        <w:t>Рисунок 16 — Android Chrome page (PARTIAL)</w:t>
+      </w:r>
+    </w:p>
+    <w:p>
+      <w:pPr>
+        <w:pStyle w:val="Heading1"/>
+      </w:pPr>
+      <w:r>
+        <w:rPr>
+          <w:rFonts w:ascii="Times New Roman" w:hAnsi="Times New Roman" w:eastAsia="Times New Roman"/>
+          <w:b/>
+          <w:sz w:val="28"/>
+        </w:rPr>
+        <w:t>10. Заключение</w:t>
       </w:r>
     </w:p>
     <w:p>
@@ -1073,7 +1445,7 @@
           <w:b w:val="0"/>
           <w:sz w:val="24"/>
         </w:rPr>
-        <w:t>КТ 09 выполнена на Android: 5 жестовых автотестов PASS, before/after скриншоты, документация ограничения iOS. KT10 не начиналась.</w:t>
+        <w:t>КТ 09: жесты Android 5/5 PASS сохранены; добавлена BASIC public-web матрица Windows×Android (2 PASS + 1 PARTIAL). iOS NOT RUN.</w:t>
       </w:r>
     </w:p>
     <w:sectPr>

</xml_diff>

<commit_message>
fix(kt09): improve Android browser compatibility coverage
Co-authored-by: Cursor <cursoragent@cursor.com>
</commit_message>
<xml_diff>
--- a/reports/KT09.docx
+++ b/reports/KT09.docx
@@ -557,7 +557,7 @@
           <w:b/>
           <w:sz w:val="28"/>
         </w:rPr>
-        <w:t>7. Remediation: BASIC OS×OS public web (2026-10-10)</w:t>
+        <w:t>7. BASIC OS×OS public web (remediation)</w:t>
       </w:r>
     </w:p>
     <w:p>
@@ -570,7 +570,7 @@
           <w:b w:val="0"/>
           <w:sz w:val="24"/>
         </w:rPr>
-        <w:t>Матрица публичного Sauce Demo: Windows Chrome PASS, Windows Firefox PASS, Android Chrome PARTIAL (adb intent + screencap; ChromeDriver 134 отсутствует для DOM-логина), iOS NOT RUN.</w:t>
+        <w:t>Публичный Sauce Demo: Windows Chrome/Firefox PASS; Android Chrome DOM PASS через Appium + pinned ChromeDriver 134.0.6998.165 (Chrome for Testing) для эмуляторного Chrome 134.0.6998.135. Overflow: не обнаружен. Ручной checklist: PENDING HUMAN VERIFICATION. iOS NOT RUN.</w:t>
       </w:r>
     </w:p>
     <w:p>
@@ -596,7 +596,7 @@
           <w:b w:val="0"/>
           <w:sz w:val="18"/>
         </w:rPr>
-        <w:t>Android smoke pytest: 1 passed in 99.04s (cell result=PARTIAL)</w:t>
+        <w:t>Android DOM: 1 passed in 16.71s (login→inventory→product→cart→menu)</w:t>
       </w:r>
     </w:p>
     <w:p>
@@ -609,7 +609,20 @@
           <w:b w:val="0"/>
           <w:sz w:val="18"/>
         </w:rPr>
-        <w:t>See docs/kt09/basic-cross-platform-matrix.md</w:t>
+        <w:t>ChromeDriver: mobile/drivers/chromedriver-134.exe (gitignored; download script)</w:t>
+      </w:r>
+    </w:p>
+    <w:p>
+      <w:pPr>
+        <w:spacing w:after="0"/>
+      </w:pPr>
+      <w:r>
+        <w:rPr>
+          <w:rFonts w:ascii="Consolas" w:hAnsi="Consolas" w:eastAsia="Consolas"/>
+          <w:b w:val="0"/>
+          <w:sz w:val="18"/>
+        </w:rPr>
+        <w:t>Manual checklist: mobile/docs/kt09-manual-checklist.md</w:t>
       </w:r>
     </w:p>
     <w:p>
@@ -1337,7 +1350,7 @@
               <a:graphicData uri="http://schemas.openxmlformats.org/drawingml/2006/picture">
                 <pic:pic>
                   <pic:nvPicPr>
-                    <pic:cNvPr id="0" name="android_chrome_01_login.png"/>
+                    <pic:cNvPr id="0" name="dom_01_login.png"/>
                     <pic:cNvPicPr/>
                   </pic:nvPicPr>
                   <pic:blipFill>
@@ -1370,7 +1383,7 @@
           <w:b w:val="0"/>
           <w:sz w:val="22"/>
         </w:rPr>
-        <w:t>Рисунок 15 — Android Chrome Sauce Demo (PARTIAL)</w:t>
+        <w:t>Рисунок 15 — Android Chrome DOM login (PASS)</w:t>
       </w:r>
     </w:p>
     <w:p>
@@ -1386,7 +1399,7 @@
               <a:graphicData uri="http://schemas.openxmlformats.org/drawingml/2006/picture">
                 <pic:pic>
                   <pic:nvPicPr>
-                    <pic:cNvPr id="0" name="android_chrome_02_inventory.png"/>
+                    <pic:cNvPr id="0" name="dom_02_inventory.png"/>
                     <pic:cNvPicPr/>
                   </pic:nvPicPr>
                   <pic:blipFill>
@@ -1419,7 +1432,154 @@
           <w:b w:val="0"/>
           <w:sz w:val="22"/>
         </w:rPr>
-        <w:t>Рисунок 16 — Android Chrome page (PARTIAL)</w:t>
+        <w:t>Рисунок 16 — Android Chrome DOM inventory</w:t>
+      </w:r>
+    </w:p>
+    <w:p>
+      <w:r>
+        <w:drawing>
+          <wp:inline xmlns:a="http://schemas.openxmlformats.org/drawingml/2006/main" xmlns:pic="http://schemas.openxmlformats.org/drawingml/2006/picture">
+            <wp:extent cx="3240000" cy="7200000"/>
+            <wp:docPr id="17" name="Picture 17"/>
+            <wp:cNvGraphicFramePr>
+              <a:graphicFrameLocks noChangeAspect="1"/>
+            </wp:cNvGraphicFramePr>
+            <a:graphic>
+              <a:graphicData uri="http://schemas.openxmlformats.org/drawingml/2006/picture">
+                <pic:pic>
+                  <pic:nvPicPr>
+                    <pic:cNvPr id="0" name="dom_03_product.png"/>
+                    <pic:cNvPicPr/>
+                  </pic:nvPicPr>
+                  <pic:blipFill>
+                    <a:blip r:embed="rId25"/>
+                    <a:stretch>
+                      <a:fillRect/>
+                    </a:stretch>
+                  </pic:blipFill>
+                  <pic:spPr>
+                    <a:xfrm>
+                      <a:off x="0" y="0"/>
+                      <a:ext cx="3240000" cy="7200000"/>
+                    </a:xfrm>
+                    <a:prstGeom prst="rect"/>
+                  </pic:spPr>
+                </pic:pic>
+              </a:graphicData>
+            </a:graphic>
+          </wp:inline>
+        </w:drawing>
+      </w:r>
+    </w:p>
+    <w:p>
+      <w:pPr>
+        <w:jc w:val="center"/>
+      </w:pPr>
+      <w:r>
+        <w:rPr>
+          <w:rFonts w:ascii="Times New Roman" w:hAnsi="Times New Roman" w:eastAsia="Times New Roman"/>
+          <w:b w:val="0"/>
+          <w:sz w:val="22"/>
+        </w:rPr>
+        <w:t>Рисунок 17 — Android Chrome DOM product</w:t>
+      </w:r>
+    </w:p>
+    <w:p>
+      <w:r>
+        <w:drawing>
+          <wp:inline xmlns:a="http://schemas.openxmlformats.org/drawingml/2006/main" xmlns:pic="http://schemas.openxmlformats.org/drawingml/2006/picture">
+            <wp:extent cx="3240000" cy="7200000"/>
+            <wp:docPr id="18" name="Picture 18"/>
+            <wp:cNvGraphicFramePr>
+              <a:graphicFrameLocks noChangeAspect="1"/>
+            </wp:cNvGraphicFramePr>
+            <a:graphic>
+              <a:graphicData uri="http://schemas.openxmlformats.org/drawingml/2006/picture">
+                <pic:pic>
+                  <pic:nvPicPr>
+                    <pic:cNvPr id="0" name="dom_04_cart.png"/>
+                    <pic:cNvPicPr/>
+                  </pic:nvPicPr>
+                  <pic:blipFill>
+                    <a:blip r:embed="rId26"/>
+                    <a:stretch>
+                      <a:fillRect/>
+                    </a:stretch>
+                  </pic:blipFill>
+                  <pic:spPr>
+                    <a:xfrm>
+                      <a:off x="0" y="0"/>
+                      <a:ext cx="3240000" cy="7200000"/>
+                    </a:xfrm>
+                    <a:prstGeom prst="rect"/>
+                  </pic:spPr>
+                </pic:pic>
+              </a:graphicData>
+            </a:graphic>
+          </wp:inline>
+        </w:drawing>
+      </w:r>
+    </w:p>
+    <w:p>
+      <w:pPr>
+        <w:jc w:val="center"/>
+      </w:pPr>
+      <w:r>
+        <w:rPr>
+          <w:rFonts w:ascii="Times New Roman" w:hAnsi="Times New Roman" w:eastAsia="Times New Roman"/>
+          <w:b w:val="0"/>
+          <w:sz w:val="22"/>
+        </w:rPr>
+        <w:t>Рисунок 18 — Android Chrome DOM cart</w:t>
+      </w:r>
+    </w:p>
+    <w:p>
+      <w:r>
+        <w:drawing>
+          <wp:inline xmlns:a="http://schemas.openxmlformats.org/drawingml/2006/main" xmlns:pic="http://schemas.openxmlformats.org/drawingml/2006/picture">
+            <wp:extent cx="3240000" cy="7200000"/>
+            <wp:docPr id="19" name="Picture 19"/>
+            <wp:cNvGraphicFramePr>
+              <a:graphicFrameLocks noChangeAspect="1"/>
+            </wp:cNvGraphicFramePr>
+            <a:graphic>
+              <a:graphicData uri="http://schemas.openxmlformats.org/drawingml/2006/picture">
+                <pic:pic>
+                  <pic:nvPicPr>
+                    <pic:cNvPr id="0" name="dom_05_menu.png"/>
+                    <pic:cNvPicPr/>
+                  </pic:nvPicPr>
+                  <pic:blipFill>
+                    <a:blip r:embed="rId27"/>
+                    <a:stretch>
+                      <a:fillRect/>
+                    </a:stretch>
+                  </pic:blipFill>
+                  <pic:spPr>
+                    <a:xfrm>
+                      <a:off x="0" y="0"/>
+                      <a:ext cx="3240000" cy="7200000"/>
+                    </a:xfrm>
+                    <a:prstGeom prst="rect"/>
+                  </pic:spPr>
+                </pic:pic>
+              </a:graphicData>
+            </a:graphic>
+          </wp:inline>
+        </w:drawing>
+      </w:r>
+    </w:p>
+    <w:p>
+      <w:pPr>
+        <w:jc w:val="center"/>
+      </w:pPr>
+      <w:r>
+        <w:rPr>
+          <w:rFonts w:ascii="Times New Roman" w:hAnsi="Times New Roman" w:eastAsia="Times New Roman"/>
+          <w:b w:val="0"/>
+          <w:sz w:val="22"/>
+        </w:rPr>
+        <w:t>Рисунок 19 — Android Chrome DOM menu</w:t>
       </w:r>
     </w:p>
     <w:p>
@@ -1445,7 +1605,7 @@
           <w:b w:val="0"/>
           <w:sz w:val="24"/>
         </w:rPr>
-        <w:t>КТ 09: жесты Android 5/5 PASS сохранены; добавлена BASIC public-web матрица Windows×Android (2 PASS + 1 PARTIAL). iOS NOT RUN.</w:t>
+        <w:t>КТ 09: жесты Android 5/5 PASS сохранены; BASIC public-web Windows×Android автоматизация PASS (включая Android DOM). Ручная проверка преподавателя остаётся PENDING HUMAN VERIFICATION. iOS NOT RUN.</w:t>
       </w:r>
     </w:p>
     <w:sectPr>

</xml_diff>

<commit_message>
fix(kt09): complete Android Chrome cross-platform automation
Co-authored-by: Cursor <cursoragent@cursor.com>
</commit_message>
<xml_diff>
--- a/reports/KT09.docx
+++ b/reports/KT09.docx
@@ -570,7 +570,7 @@
           <w:b w:val="0"/>
           <w:sz w:val="24"/>
         </w:rPr>
-        <w:t>Публичный Sauce Demo: Windows Chrome/Firefox PASS; Android Chrome DOM PASS через Appium + pinned ChromeDriver 134.0.6998.165 (Chrome for Testing) для эмуляторного Chrome 134.0.6998.135. Overflow: не обнаружен. Ручной checklist: PENDING HUMAN VERIFICATION. iOS NOT RUN.</w:t>
+        <w:t>Публичный Sauce Demo: Windows Chrome/Firefox PASS; Android Chrome DOM suite TC09-W01…W10 + journey: 11 passed in 36.91s (ChromeDriver 134.0.6998.165 / Chrome 134.0.6998.135). Overflow: нет. Ручной checklist: PENDING HUMAN VERIFICATION. iOS NOT RUN.</w:t>
       </w:r>
     </w:p>
     <w:p>
@@ -596,7 +596,7 @@
           <w:b w:val="0"/>
           <w:sz w:val="18"/>
         </w:rPr>
-        <w:t>Android DOM: 1 passed in 16.71s (login→inventory→product→cart→menu)</w:t>
+        <w:t>Android DOM: 11 passed in 36.91s (TC09-W01…W10 + journey)</w:t>
       </w:r>
     </w:p>
     <w:p>
@@ -609,7 +609,7 @@
           <w:b w:val="0"/>
           <w:sz w:val="18"/>
         </w:rPr>
-        <w:t>ChromeDriver: mobile/drivers/chromedriver-134.exe (gitignored; download script)</w:t>
+        <w:t>ChromeDriver: mobile/drivers/chromedriver-134.exe</w:t>
       </w:r>
     </w:p>
     <w:p>
@@ -622,7 +622,7 @@
           <w:b w:val="0"/>
           <w:sz w:val="18"/>
         </w:rPr>
-        <w:t>Manual checklist: mobile/docs/kt09-manual-checklist.md</w:t>
+        <w:t>Manual checklist: PENDING HUMAN VERIFICATION</w:t>
       </w:r>
     </w:p>
     <w:p>
@@ -1350,7 +1350,7 @@
               <a:graphicData uri="http://schemas.openxmlformats.org/drawingml/2006/picture">
                 <pic:pic>
                   <pic:nvPicPr>
-                    <pic:cNvPr id="0" name="dom_01_login.png"/>
+                    <pic:cNvPr id="0" name="tc09_w01_loading.png"/>
                     <pic:cNvPicPr/>
                   </pic:nvPicPr>
                   <pic:blipFill>
@@ -1383,7 +1383,7 @@
           <w:b w:val="0"/>
           <w:sz w:val="22"/>
         </w:rPr>
-        <w:t>Рисунок 15 — Android Chrome DOM login (PASS)</w:t>
+        <w:t>Рисунок 15 — TC09-W01 Android loading</w:t>
       </w:r>
     </w:p>
     <w:p>
@@ -1399,7 +1399,7 @@
               <a:graphicData uri="http://schemas.openxmlformats.org/drawingml/2006/picture">
                 <pic:pic>
                   <pic:nvPicPr>
-                    <pic:cNvPr id="0" name="dom_02_inventory.png"/>
+                    <pic:cNvPr id="0" name="tc09_w03_authenticated.png"/>
                     <pic:cNvPicPr/>
                   </pic:nvPicPr>
                   <pic:blipFill>
@@ -1432,7 +1432,7 @@
           <w:b w:val="0"/>
           <w:sz w:val="22"/>
         </w:rPr>
-        <w:t>Рисунок 16 — Android Chrome DOM inventory</w:t>
+        <w:t>Рисунок 16 — TC09-W03 Android authenticated</w:t>
       </w:r>
     </w:p>
     <w:p>
@@ -1448,7 +1448,7 @@
               <a:graphicData uri="http://schemas.openxmlformats.org/drawingml/2006/picture">
                 <pic:pic>
                   <pic:nvPicPr>
-                    <pic:cNvPr id="0" name="dom_03_product.png"/>
+                    <pic:cNvPr id="0" name="tc09_w04_inventory.png"/>
                     <pic:cNvPicPr/>
                   </pic:nvPicPr>
                   <pic:blipFill>
@@ -1481,7 +1481,7 @@
           <w:b w:val="0"/>
           <w:sz w:val="22"/>
         </w:rPr>
-        <w:t>Рисунок 17 — Android Chrome DOM product</w:t>
+        <w:t>Рисунок 17 — TC09-W04 Android inventory</w:t>
       </w:r>
     </w:p>
     <w:p>
@@ -1497,7 +1497,7 @@
               <a:graphicData uri="http://schemas.openxmlformats.org/drawingml/2006/picture">
                 <pic:pic>
                   <pic:nvPicPr>
-                    <pic:cNvPr id="0" name="dom_04_cart.png"/>
+                    <pic:cNvPr id="0" name="tc09_w07_cart.png"/>
                     <pic:cNvPicPr/>
                   </pic:nvPicPr>
                   <pic:blipFill>
@@ -1530,7 +1530,7 @@
           <w:b w:val="0"/>
           <w:sz w:val="22"/>
         </w:rPr>
-        <w:t>Рисунок 18 — Android Chrome DOM cart</w:t>
+        <w:t>Рисунок 18 — TC09-W07 Android cart</w:t>
       </w:r>
     </w:p>
     <w:p>
@@ -1546,7 +1546,7 @@
               <a:graphicData uri="http://schemas.openxmlformats.org/drawingml/2006/picture">
                 <pic:pic>
                   <pic:nvPicPr>
-                    <pic:cNvPr id="0" name="dom_05_menu.png"/>
+                    <pic:cNvPr id="0" name="tc09_w08_checkout_validation.png"/>
                     <pic:cNvPicPr/>
                   </pic:nvPicPr>
                   <pic:blipFill>
@@ -1579,7 +1579,105 @@
           <w:b w:val="0"/>
           <w:sz w:val="22"/>
         </w:rPr>
-        <w:t>Рисунок 19 — Android Chrome DOM menu</w:t>
+        <w:t>Рисунок 19 — TC09-W08 checkout validation</w:t>
+      </w:r>
+    </w:p>
+    <w:p>
+      <w:r>
+        <w:drawing>
+          <wp:inline xmlns:a="http://schemas.openxmlformats.org/drawingml/2006/main" xmlns:pic="http://schemas.openxmlformats.org/drawingml/2006/picture">
+            <wp:extent cx="3240000" cy="7200000"/>
+            <wp:docPr id="20" name="Picture 20"/>
+            <wp:cNvGraphicFramePr>
+              <a:graphicFrameLocks noChangeAspect="1"/>
+            </wp:cNvGraphicFramePr>
+            <a:graphic>
+              <a:graphicData uri="http://schemas.openxmlformats.org/drawingml/2006/picture">
+                <pic:pic>
+                  <pic:nvPicPr>
+                    <pic:cNvPr id="0" name="tc09_w09_menu.png"/>
+                    <pic:cNvPicPr/>
+                  </pic:nvPicPr>
+                  <pic:blipFill>
+                    <a:blip r:embed="rId28"/>
+                    <a:stretch>
+                      <a:fillRect/>
+                    </a:stretch>
+                  </pic:blipFill>
+                  <pic:spPr>
+                    <a:xfrm>
+                      <a:off x="0" y="0"/>
+                      <a:ext cx="3240000" cy="7200000"/>
+                    </a:xfrm>
+                    <a:prstGeom prst="rect"/>
+                  </pic:spPr>
+                </pic:pic>
+              </a:graphicData>
+            </a:graphic>
+          </wp:inline>
+        </w:drawing>
+      </w:r>
+    </w:p>
+    <w:p>
+      <w:pPr>
+        <w:jc w:val="center"/>
+      </w:pPr>
+      <w:r>
+        <w:rPr>
+          <w:rFonts w:ascii="Times New Roman" w:hAnsi="Times New Roman" w:eastAsia="Times New Roman"/>
+          <w:b w:val="0"/>
+          <w:sz w:val="22"/>
+        </w:rPr>
+        <w:t>Рисунок 20 — TC09-W09 burger menu</w:t>
+      </w:r>
+    </w:p>
+    <w:p>
+      <w:r>
+        <w:drawing>
+          <wp:inline xmlns:a="http://schemas.openxmlformats.org/drawingml/2006/main" xmlns:pic="http://schemas.openxmlformats.org/drawingml/2006/picture">
+            <wp:extent cx="3240000" cy="7200000"/>
+            <wp:docPr id="21" name="Picture 21"/>
+            <wp:cNvGraphicFramePr>
+              <a:graphicFrameLocks noChangeAspect="1"/>
+            </wp:cNvGraphicFramePr>
+            <a:graphic>
+              <a:graphicData uri="http://schemas.openxmlformats.org/drawingml/2006/picture">
+                <pic:pic>
+                  <pic:nvPicPr>
+                    <pic:cNvPr id="0" name="tc09_w10_layout.png"/>
+                    <pic:cNvPicPr/>
+                  </pic:nvPicPr>
+                  <pic:blipFill>
+                    <a:blip r:embed="rId29"/>
+                    <a:stretch>
+                      <a:fillRect/>
+                    </a:stretch>
+                  </pic:blipFill>
+                  <pic:spPr>
+                    <a:xfrm>
+                      <a:off x="0" y="0"/>
+                      <a:ext cx="3240000" cy="7200000"/>
+                    </a:xfrm>
+                    <a:prstGeom prst="rect"/>
+                  </pic:spPr>
+                </pic:pic>
+              </a:graphicData>
+            </a:graphic>
+          </wp:inline>
+        </w:drawing>
+      </w:r>
+    </w:p>
+    <w:p>
+      <w:pPr>
+        <w:jc w:val="center"/>
+      </w:pPr>
+      <w:r>
+        <w:rPr>
+          <w:rFonts w:ascii="Times New Roman" w:hAnsi="Times New Roman" w:eastAsia="Times New Roman"/>
+          <w:b w:val="0"/>
+          <w:sz w:val="22"/>
+        </w:rPr>
+        <w:t>Рисунок 21 — TC09-W10 layout / overflow</w:t>
       </w:r>
     </w:p>
     <w:p>
@@ -1605,7 +1703,7 @@
           <w:b w:val="0"/>
           <w:sz w:val="24"/>
         </w:rPr>
-        <w:t>КТ 09: жесты Android 5/5 PASS сохранены; BASIC public-web Windows×Android автоматизация PASS (включая Android DOM). Ручная проверка преподавателя остаётся PENDING HUMAN VERIFICATION. iOS NOT RUN.</w:t>
+        <w:t>КТ 09: жесты 5/5 PASS сохранены; BASIC web Windows PASS + Android DOM 11/11 PASS (36.91 с). Ручная проверка: PENDING HUMAN VERIFICATION. iOS NOT RUN.</w:t>
       </w:r>
     </w:p>
     <w:sectPr>

</xml_diff>

<commit_message>
docs(kt09): finalize manual testing checklist
Add human-only execution guide; keep PENDING HUMAN VERIFICATION; refresh KT09.docx layers.

Co-authored-by: Cursor <cursoragent@cursor.com>
</commit_message>
<xml_diff>
--- a/reports/KT09.docx
+++ b/reports/KT09.docx
@@ -27,7 +27,49 @@
           <w:b w:val="0"/>
           <w:sz w:val="24"/>
         </w:rPr>
-        <w:t>Студент: _______________________________________</w:t>
+        <w:t>Учебное заведение: _______________________</w:t>
+      </w:r>
+    </w:p>
+    <w:p>
+      <w:pPr>
+        <w:spacing w:after="120"/>
+        <w:jc w:val="center"/>
+      </w:pPr>
+      <w:r>
+        <w:rPr>
+          <w:rFonts w:ascii="Times New Roman" w:hAnsi="Times New Roman" w:eastAsia="Times New Roman"/>
+          <w:b w:val="0"/>
+          <w:sz w:val="24"/>
+        </w:rPr>
+        <w:t>Студент: _________________________________</w:t>
+      </w:r>
+    </w:p>
+    <w:p>
+      <w:pPr>
+        <w:spacing w:after="120"/>
+        <w:jc w:val="center"/>
+      </w:pPr>
+      <w:r>
+        <w:rPr>
+          <w:rFonts w:ascii="Times New Roman" w:hAnsi="Times New Roman" w:eastAsia="Times New Roman"/>
+          <w:b w:val="0"/>
+          <w:sz w:val="24"/>
+        </w:rPr>
+        <w:t>Преподаватель: ___________________________</w:t>
+      </w:r>
+    </w:p>
+    <w:p>
+      <w:pPr>
+        <w:spacing w:after="120"/>
+        <w:jc w:val="center"/>
+      </w:pPr>
+      <w:r>
+        <w:rPr>
+          <w:rFonts w:ascii="Times New Roman" w:hAnsi="Times New Roman" w:eastAsia="Times New Roman"/>
+          <w:b w:val="0"/>
+          <w:sz w:val="24"/>
+        </w:rPr>
+        <w:t>Группа: __________________________________</w:t>
       </w:r>
     </w:p>
     <w:p>
@@ -81,7 +123,7 @@
           <w:b w:val="0"/>
           <w:sz w:val="24"/>
         </w:rPr>
-        <w:t>Дата: 2026-10-10</w:t>
+        <w:t>Дата обновления: 2026-10-11</w:t>
       </w:r>
     </w:p>
     <w:p>
@@ -557,7 +599,7 @@
           <w:b/>
           <w:sz w:val="28"/>
         </w:rPr>
-        <w:t>7. BASIC OS×OS public web (remediation)</w:t>
+        <w:t>7. Слои доказательств (разделение)</w:t>
       </w:r>
     </w:p>
     <w:p>
@@ -570,7 +612,59 @@
           <w:b w:val="0"/>
           <w:sz w:val="24"/>
         </w:rPr>
-        <w:t>Публичный Sauce Demo: Windows Chrome/Firefox PASS; Android Chrome DOM suite TC09-W01…W10 + journey: 11 passed in 36.91s (ChromeDriver 134.0.6998.165 / Chrome 134.0.6998.135). Overflow: нет. Ручной checklist: PENDING HUMAN VERIFICATION. iOS NOT RUN.</w:t>
+        <w:t>1) Исторические жесты Android Appium — 5 PASS / 54.93 с (supplementary).</w:t>
+      </w:r>
+    </w:p>
+    <w:p>
+      <w:pPr>
+        <w:spacing w:after="120"/>
+      </w:pPr>
+      <w:r>
+        <w:rPr>
+          <w:rFonts w:ascii="Times New Roman" w:hAnsi="Times New Roman" w:eastAsia="Times New Roman"/>
+          <w:b w:val="0"/>
+          <w:sz w:val="24"/>
+        </w:rPr>
+        <w:t>2) Windows automated web (Selenium) — 2 PASS / 12.43 с.</w:t>
+      </w:r>
+    </w:p>
+    <w:p>
+      <w:pPr>
+        <w:spacing w:after="120"/>
+      </w:pPr>
+      <w:r>
+        <w:rPr>
+          <w:rFonts w:ascii="Times New Roman" w:hAnsi="Times New Roman" w:eastAsia="Times New Roman"/>
+          <w:b w:val="0"/>
+          <w:sz w:val="24"/>
+        </w:rPr>
+        <w:t>3) Android automated web (Appium Chrome DOM) — 11 PASS / 36.91 с.</w:t>
+      </w:r>
+    </w:p>
+    <w:p>
+      <w:pPr>
+        <w:spacing w:after="120"/>
+      </w:pPr>
+      <w:r>
+        <w:rPr>
+          <w:rFonts w:ascii="Times New Roman" w:hAnsi="Times New Roman" w:eastAsia="Times New Roman"/>
+          <w:b/>
+          <w:sz w:val="24"/>
+        </w:rPr>
+        <w:t>4) Genuine manual execution — PENDING HUMAN VERIFICATION (см. mobile/docs/kt09-manual-checklist.md и kt09-manual-execution-guide.md). Автоматизация не заменяет ручной прогон.</w:t>
+      </w:r>
+    </w:p>
+    <w:p>
+      <w:pPr>
+        <w:spacing w:after="120"/>
+      </w:pPr>
+      <w:r>
+        <w:rPr>
+          <w:rFonts w:ascii="Times New Roman" w:hAnsi="Times New Roman" w:eastAsia="Times New Roman"/>
+          <w:b w:val="0"/>
+          <w:sz w:val="24"/>
+        </w:rPr>
+        <w:t>5) Cross-platform conclusions — automation Compatible; manual TBD.</w:t>
       </w:r>
     </w:p>
     <w:p>
@@ -583,7 +677,7 @@
           <w:b w:val="0"/>
           <w:sz w:val="18"/>
         </w:rPr>
-        <w:t>Windows: 2 passed in 12.43s</w:t>
+        <w:t>Windows auto: 2 passed in 12.43s</w:t>
       </w:r>
     </w:p>
     <w:p>
@@ -596,7 +690,7 @@
           <w:b w:val="0"/>
           <w:sz w:val="18"/>
         </w:rPr>
-        <w:t>Android DOM: 11 passed in 36.91s (TC09-W01…W10 + journey)</w:t>
+        <w:t>Android DOM auto: 11 passed in 36.91s (TC09-W01…W10 + journey)</w:t>
       </w:r>
     </w:p>
     <w:p>
@@ -623,6 +717,19 @@
           <w:sz w:val="18"/>
         </w:rPr>
         <w:t>Manual checklist: PENDING HUMAN VERIFICATION</w:t>
+      </w:r>
+    </w:p>
+    <w:p>
+      <w:pPr>
+        <w:spacing w:after="0"/>
+      </w:pPr>
+      <w:r>
+        <w:rPr>
+          <w:rFonts w:ascii="Consolas" w:hAnsi="Consolas" w:eastAsia="Consolas"/>
+          <w:b w:val="0"/>
+          <w:sz w:val="18"/>
+        </w:rPr>
+        <w:t>Manual screenshots dirs: screenshots/kt09/manual/{windows,android}/</w:t>
       </w:r>
     </w:p>
     <w:p>
@@ -1138,7 +1245,7 @@
           <w:b/>
           <w:sz w:val="28"/>
         </w:rPr>
-        <w:t>9. Скриншоты — BASIC cross-platform web</w:t>
+        <w:t>9. Скриншоты — automated cross-platform web (not manual)</w:t>
       </w:r>
     </w:p>
     <w:p>

</xml_diff>

<commit_message>
fix(kt09): recapture readable Android SauceDemo screenshots
Replace GPU-glitched Android evidence with ChromeDriver web shots after soft-GPU emulator boot; regenerate KT09.docx and submission zip.

Co-authored-by: Cursor <cursoragent@cursor.com>
</commit_message>
<xml_diff>
--- a/reports/KT09.docx
+++ b/reports/KT09.docx
@@ -292,7 +292,7 @@
           <w:b w:val="0"/>
           <w:sz w:val="18"/>
         </w:rPr>
-        <w:t>Android automated visual set: 8 screenshots (DOM suite + order complete)</w:t>
+        <w:t>Android Chrome automated visual set: 8 screenshots (Appium + ChromeDriver web screenshot, emulator soft GPU; scripts/capture_kt09_android_visual.py)</w:t>
       </w:r>
     </w:p>
     <w:p>
@@ -452,7 +452,7 @@
       <w:r>
         <w:drawing>
           <wp:inline xmlns:a="http://schemas.openxmlformats.org/drawingml/2006/main" xmlns:pic="http://schemas.openxmlformats.org/drawingml/2006/picture">
-            <wp:extent cx="3060000" cy="6800000"/>
+            <wp:extent cx="3060000" cy="6443000"/>
             <wp:docPr id="2" name="Picture 2"/>
             <wp:cNvGraphicFramePr>
               <a:graphicFrameLocks noChangeAspect="1"/>
@@ -473,7 +473,7 @@
                   <pic:spPr>
                     <a:xfrm>
                       <a:off x="0" y="0"/>
-                      <a:ext cx="3060000" cy="6800000"/>
+                      <a:ext cx="3060000" cy="6443000"/>
                     </a:xfrm>
                     <a:prstGeom prst="rect"/>
                   </pic:spPr>
@@ -615,7 +615,7 @@
       <w:r>
         <w:drawing>
           <wp:inline xmlns:a="http://schemas.openxmlformats.org/drawingml/2006/main" xmlns:pic="http://schemas.openxmlformats.org/drawingml/2006/picture">
-            <wp:extent cx="3060000" cy="6800000"/>
+            <wp:extent cx="3060000" cy="6443000"/>
             <wp:docPr id="4" name="Picture 4"/>
             <wp:cNvGraphicFramePr>
               <a:graphicFrameLocks noChangeAspect="1"/>
@@ -636,7 +636,7 @@
                   <pic:spPr>
                     <a:xfrm>
                       <a:off x="0" y="0"/>
-                      <a:ext cx="3060000" cy="6800000"/>
+                      <a:ext cx="3060000" cy="6443000"/>
                     </a:xfrm>
                     <a:prstGeom prst="rect"/>
                   </pic:spPr>
@@ -778,7 +778,7 @@
       <w:r>
         <w:drawing>
           <wp:inline xmlns:a="http://schemas.openxmlformats.org/drawingml/2006/main" xmlns:pic="http://schemas.openxmlformats.org/drawingml/2006/picture">
-            <wp:extent cx="3060000" cy="6800000"/>
+            <wp:extent cx="3060000" cy="6443000"/>
             <wp:docPr id="6" name="Picture 6"/>
             <wp:cNvGraphicFramePr>
               <a:graphicFrameLocks noChangeAspect="1"/>
@@ -799,7 +799,7 @@
                   <pic:spPr>
                     <a:xfrm>
                       <a:off x="0" y="0"/>
-                      <a:ext cx="3060000" cy="6800000"/>
+                      <a:ext cx="3060000" cy="6443000"/>
                     </a:xfrm>
                     <a:prstGeom prst="rect"/>
                   </pic:spPr>
@@ -941,7 +941,7 @@
       <w:r>
         <w:drawing>
           <wp:inline xmlns:a="http://schemas.openxmlformats.org/drawingml/2006/main" xmlns:pic="http://schemas.openxmlformats.org/drawingml/2006/picture">
-            <wp:extent cx="3060000" cy="6800000"/>
+            <wp:extent cx="3060000" cy="6443000"/>
             <wp:docPr id="8" name="Picture 8"/>
             <wp:cNvGraphicFramePr>
               <a:graphicFrameLocks noChangeAspect="1"/>
@@ -962,7 +962,7 @@
                   <pic:spPr>
                     <a:xfrm>
                       <a:off x="0" y="0"/>
-                      <a:ext cx="3060000" cy="6800000"/>
+                      <a:ext cx="3060000" cy="6443000"/>
                     </a:xfrm>
                     <a:prstGeom prst="rect"/>
                   </pic:spPr>
@@ -1104,7 +1104,7 @@
       <w:r>
         <w:drawing>
           <wp:inline xmlns:a="http://schemas.openxmlformats.org/drawingml/2006/main" xmlns:pic="http://schemas.openxmlformats.org/drawingml/2006/picture">
-            <wp:extent cx="3060000" cy="6800000"/>
+            <wp:extent cx="3060000" cy="6443000"/>
             <wp:docPr id="10" name="Picture 10"/>
             <wp:cNvGraphicFramePr>
               <a:graphicFrameLocks noChangeAspect="1"/>
@@ -1125,7 +1125,7 @@
                   <pic:spPr>
                     <a:xfrm>
                       <a:off x="0" y="0"/>
-                      <a:ext cx="3060000" cy="6800000"/>
+                      <a:ext cx="3060000" cy="6443000"/>
                     </a:xfrm>
                     <a:prstGeom prst="rect"/>
                   </pic:spPr>
@@ -1267,7 +1267,7 @@
       <w:r>
         <w:drawing>
           <wp:inline xmlns:a="http://schemas.openxmlformats.org/drawingml/2006/main" xmlns:pic="http://schemas.openxmlformats.org/drawingml/2006/picture">
-            <wp:extent cx="3060000" cy="6800000"/>
+            <wp:extent cx="3060000" cy="6443000"/>
             <wp:docPr id="12" name="Picture 12"/>
             <wp:cNvGraphicFramePr>
               <a:graphicFrameLocks noChangeAspect="1"/>
@@ -1288,7 +1288,7 @@
                   <pic:spPr>
                     <a:xfrm>
                       <a:off x="0" y="0"/>
-                      <a:ext cx="3060000" cy="6800000"/>
+                      <a:ext cx="3060000" cy="6443000"/>
                     </a:xfrm>
                     <a:prstGeom prst="rect"/>
                   </pic:spPr>
@@ -1430,7 +1430,7 @@
       <w:r>
         <w:drawing>
           <wp:inline xmlns:a="http://schemas.openxmlformats.org/drawingml/2006/main" xmlns:pic="http://schemas.openxmlformats.org/drawingml/2006/picture">
-            <wp:extent cx="3060000" cy="6800000"/>
+            <wp:extent cx="3060000" cy="6443000"/>
             <wp:docPr id="14" name="Picture 14"/>
             <wp:cNvGraphicFramePr>
               <a:graphicFrameLocks noChangeAspect="1"/>
@@ -1451,7 +1451,7 @@
                   <pic:spPr>
                     <a:xfrm>
                       <a:off x="0" y="0"/>
-                      <a:ext cx="3060000" cy="6800000"/>
+                      <a:ext cx="3060000" cy="6443000"/>
                     </a:xfrm>
                     <a:prstGeom prst="rect"/>
                   </pic:spPr>
@@ -1593,7 +1593,7 @@
       <w:r>
         <w:drawing>
           <wp:inline xmlns:a="http://schemas.openxmlformats.org/drawingml/2006/main" xmlns:pic="http://schemas.openxmlformats.org/drawingml/2006/picture">
-            <wp:extent cx="3060000" cy="6800000"/>
+            <wp:extent cx="3060000" cy="6443000"/>
             <wp:docPr id="16" name="Picture 16"/>
             <wp:cNvGraphicFramePr>
               <a:graphicFrameLocks noChangeAspect="1"/>
@@ -1614,7 +1614,7 @@
                   <pic:spPr>
                     <a:xfrm>
                       <a:off x="0" y="0"/>
-                      <a:ext cx="3060000" cy="6800000"/>
+                      <a:ext cx="3060000" cy="6443000"/>
                     </a:xfrm>
                     <a:prstGeom prst="rect"/>
                   </pic:spPr>

</xml_diff>

<commit_message>
fix(kt09): remove corrupted screenshot evidence and correct capture paths
Co-authored-by: Cursor <cursoragent@cursor.com>
</commit_message>
<xml_diff>
--- a/reports/KT09.docx
+++ b/reports/KT09.docx
@@ -173,7 +173,7 @@
           <w:b w:val="0"/>
           <w:sz w:val="24"/>
         </w:rPr>
-        <w:t>Android: эмулятор emulator-5554 (Android 16 / API 36), Chrome 134.0.6998.135, ChromeDriver 134.0.6998.165, Appium 3.8. Скриншоты — screenshots/kt09/automated/android/ (тоже 8). Их снимал DOM-suite TC09-W* плюс отдельный захват checkout-complete.</w:t>
+        <w:t>Android: эмулятор emulator-5554 (Android 16 / API 36), Chrome 134.0.6998.135, ChromeDriver 134.0.6998.165, Appium 3.8. Визуальные кадры — screenshots/kt09/automated/android/ (8 шт.), сняты через ChromeDriver с appium:nativeWebScreenshot=false (скрипт capture_kt09_android_visual.py). Это снимок веб-контента страницы, без полной native-рамки Android UI.</w:t>
       </w:r>
     </w:p>
     <w:p>
@@ -186,7 +186,7 @@
           <w:b/>
           <w:sz w:val="24"/>
         </w:rPr>
-        <w:t>Важно: все скриншоты в отчёте — AUTOMATED evidence. Manual verification: PENDING HUMAN VERIFICATION.</w:t>
+        <w:t>Важно: все скриншоты сравнения в отчёте — AUTOMATED evidence. Старые PNG из screenshots/kt09/crossplatform/ (GPU-glitch / Chrome-диалоги) в отчёт не входят — вынесены в archive/unusable-visual/. Manual verification: PENDING HUMAN VERIFICATION.</w:t>
       </w:r>
     </w:p>
     <w:p>

</xml_diff>